<commit_message>
docs: refresh Week 5 acceptance reports
</commit_message>
<xml_diff>
--- a/docs/week5/reports/UI可用性测试报告.docx
+++ b/docs/week5/reports/UI可用性测试报告.docx
@@ -81,7 +81,7 @@
           <w:color w:val="000000"/>
           <w:sz w:val="22"/>
         </w:rPr>
-        <w:t>Week 5 Draft 1.0</w:t>
+        <w:t>Week 5 Draft 1.1</w:t>
       </w:r>
     </w:p>
     <w:p>
@@ -106,7 +106,7 @@
           <w:color w:val="000000"/>
           <w:sz w:val="22"/>
         </w:rPr>
-        <w:t>2026-08-11</w:t>
+        <w:t>2026-08-12</w:t>
       </w:r>
     </w:p>
     <w:p>
@@ -131,7 +131,7 @@
           <w:color w:val="000000"/>
           <w:sz w:val="22"/>
         </w:rPr>
-        <w:t>04c498f37315f455c5fcc625f66268e460204065</w:t>
+        <w:t>e32a6cf718be3862c4603132b82f95013f525c13</w:t>
       </w:r>
     </w:p>
     <w:p>

</xml_diff>

<commit_message>
test: complete Week 5 WAVE validation
</commit_message>
<xml_diff>
--- a/docs/week5/reports/UI可用性测试报告.docx
+++ b/docs/week5/reports/UI可用性测试报告.docx
@@ -81,7 +81,7 @@
           <w:color w:val="000000"/>
           <w:sz w:val="22"/>
         </w:rPr>
-        <w:t>Week 5 Draft 1.1</w:t>
+        <w:t>Week 5 Draft 1.2</w:t>
       </w:r>
     </w:p>
     <w:p>
@@ -106,7 +106,7 @@
           <w:color w:val="000000"/>
           <w:sz w:val="22"/>
         </w:rPr>
-        <w:t>2026-08-12</w:t>
+        <w:t>2026-08-13</w:t>
       </w:r>
     </w:p>
     <w:p>

</xml_diff>

<commit_message>
docs: assemble final Week 5 submission
</commit_message>
<xml_diff>
--- a/docs/week5/reports/UI可用性测试报告.docx
+++ b/docs/week5/reports/UI可用性测试报告.docx
@@ -56,7 +56,7 @@
           <w:color w:val="000000"/>
           <w:sz w:val="22"/>
         </w:rPr>
-        <w:t>BLOCKED（0/3 参与者已完成）</w:t>
+        <w:t>阶段性提交；BLOCKED（0/3 参与者已完成）</w:t>
       </w:r>
     </w:p>
     <w:p>
@@ -81,7 +81,7 @@
           <w:color w:val="000000"/>
           <w:sz w:val="22"/>
         </w:rPr>
-        <w:t>Week 5 Draft 1.2</w:t>
+        <w:t>Week 5 Final Draft 1.3</w:t>
       </w:r>
     </w:p>
     <w:p>
@@ -131,7 +131,7 @@
           <w:color w:val="000000"/>
           <w:sz w:val="22"/>
         </w:rPr>
-        <w:t>e32a6cf718be3862c4603132b82f95013f525c13</w:t>
+        <w:t>875bb430f93d11d43b78d738328e633f48f57283</w:t>
       </w:r>
     </w:p>
     <w:p>

</xml_diff>

<commit_message>
docs: add UI screenshots to usability report
</commit_message>
<xml_diff>
--- a/docs/week5/reports/UI可用性测试报告.docx
+++ b/docs/week5/reports/UI可用性测试报告.docx
@@ -65,23 +65,13 @@
       </w:pPr>
       <w:r>
         <w:rPr>
-          <w:rFonts w:ascii="Times New Roman" w:hAnsi="Times New Roman" w:eastAsia="宋体"/>
-          <w:b/>
-          <w:i w:val="0"/>
-          <w:color w:val="000000"/>
-          <w:sz w:val="22"/>
-        </w:rPr>
-        <w:t>版本：</w:t>
-      </w:r>
-      <w:r>
-        <w:rPr>
-          <w:rFonts w:ascii="Times New Roman" w:hAnsi="Times New Roman" w:eastAsia="宋体"/>
+          <w:rFonts w:ascii="Times New Roman" w:hAnsi="Times New Roman" w:eastAsia="Times New Roman" w:cs="Times New Roman"/>
           <w:b w:val="0"/>
           <w:i w:val="0"/>
           <w:color w:val="000000"/>
           <w:sz w:val="22"/>
         </w:rPr>
-        <w:t>Week 5 Final Draft 1.3</w:t>
+        <w:t>版本：Week 5 Final Draft 1.4</w:t>
       </w:r>
     </w:p>
     <w:p>
@@ -90,23 +80,13 @@
       </w:pPr>
       <w:r>
         <w:rPr>
-          <w:rFonts w:ascii="Times New Roman" w:hAnsi="Times New Roman" w:eastAsia="宋体"/>
-          <w:b/>
-          <w:i w:val="0"/>
-          <w:color w:val="000000"/>
-          <w:sz w:val="22"/>
-        </w:rPr>
-        <w:t>日期：</w:t>
-      </w:r>
-      <w:r>
-        <w:rPr>
-          <w:rFonts w:ascii="Times New Roman" w:hAnsi="Times New Roman" w:eastAsia="宋体"/>
+          <w:rFonts w:ascii="Times New Roman" w:hAnsi="Times New Roman" w:eastAsia="Times New Roman" w:cs="Times New Roman"/>
           <w:b w:val="0"/>
           <w:i w:val="0"/>
           <w:color w:val="000000"/>
           <w:sz w:val="22"/>
         </w:rPr>
-        <w:t>2026-08-13</w:t>
+        <w:t>日期：2026-08-14</w:t>
       </w:r>
     </w:p>
     <w:p>
@@ -173,6 +153,153 @@
           <w:sz w:val="22"/>
         </w:rPr>
         <w:t>目标是验证用户能否完成后端状态确认、搜索与筛选、结果打开/复制、索引库添加/进度/重建/移除以及无障碍设置。</w:t>
+      </w:r>
+    </w:p>
+    <w:p>
+      <w:pPr>
+        <w:pStyle w:val="Heading2"/>
+        <w:keepNext/>
+      </w:pPr>
+      <w:r>
+        <w:rPr>
+          <w:rFonts w:ascii="Times New Roman" w:hAnsi="Times New Roman" w:eastAsia="Times New Roman" w:cs="Times New Roman"/>
+          <w:b/>
+          <w:i w:val="0"/>
+          <w:color w:val="000000"/>
+          <w:sz w:val="26"/>
+        </w:rPr>
+        <w:t>1.1 实际界面与测试任务映射</w:t>
+      </w:r>
+    </w:p>
+    <w:p>
+      <w:pPr>
+        <w:spacing w:after="120"/>
+      </w:pPr>
+      <w:r>
+        <w:rPr>
+          <w:rFonts w:ascii="Times New Roman" w:hAnsi="Times New Roman" w:eastAsia="Times New Roman" w:cs="Times New Roman"/>
+          <w:b w:val="0"/>
+          <w:i w:val="0"/>
+          <w:color w:val="000000"/>
+          <w:sz w:val="22"/>
+        </w:rPr>
+        <w:t>以下截图来自 Windows 桌面端 Week 5 实际运行环境，用于说明预定任务对应的界面状态；截图仅作为测试准备与界面基线，不替代真实参与者数据。</w:t>
+      </w:r>
+    </w:p>
+    <w:p>
+      <w:pPr>
+        <w:keepNext/>
+        <w:spacing w:before="120" w:after="60"/>
+        <w:jc w:val="center"/>
+      </w:pPr>
+      <w:r>
+        <w:drawing>
+          <wp:inline xmlns:a="http://schemas.openxmlformats.org/drawingml/2006/main" xmlns:pic="http://schemas.openxmlformats.org/drawingml/2006/picture">
+            <wp:extent cx="5715000" cy="3571875"/>
+            <wp:docPr id="1" name="Picture 1" descr="Windows 桌面端搜索主页。左侧为搜索、索引库和设置导航；顶部显示后端在线；主区域包含搜索框、筛选按钮、搜索按钮和初始提示。界面启用深色高对比度与 200% 字号。" title="图 1  搜索主页"/>
+            <wp:cNvGraphicFramePr>
+              <a:graphicFrameLocks noChangeAspect="1"/>
+            </wp:cNvGraphicFramePr>
+            <a:graphic>
+              <a:graphicData uri="http://schemas.openxmlformats.org/drawingml/2006/picture">
+                <pic:pic>
+                  <pic:nvPicPr>
+                    <pic:cNvPr id="0" name="windows-search-hc-200-ready.png"/>
+                    <pic:cNvPicPr/>
+                  </pic:nvPicPr>
+                  <pic:blipFill>
+                    <a:blip r:embed="rId13"/>
+                    <a:stretch>
+                      <a:fillRect/>
+                    </a:stretch>
+                  </pic:blipFill>
+                  <pic:spPr>
+                    <a:xfrm>
+                      <a:off x="0" y="0"/>
+                      <a:ext cx="5715000" cy="3571875"/>
+                    </a:xfrm>
+                    <a:prstGeom prst="rect"/>
+                  </pic:spPr>
+                </pic:pic>
+              </a:graphicData>
+            </a:graphic>
+          </wp:inline>
+        </w:drawing>
+      </w:r>
+    </w:p>
+    <w:p>
+      <w:pPr>
+        <w:keepNext w:val="0"/>
+        <w:spacing w:before="0" w:after="160"/>
+        <w:jc w:val="center"/>
+      </w:pPr>
+      <w:r>
+        <w:rPr>
+          <w:rFonts w:ascii="Times New Roman" w:hAnsi="Times New Roman" w:eastAsia="Times New Roman" w:cs="Times New Roman"/>
+          <w:b w:val="0"/>
+          <w:i w:val="0"/>
+          <w:color w:val="000000"/>
+          <w:sz w:val="18"/>
+        </w:rPr>
+        <w:t>图 1  搜索主页：后端在线、搜索框、筛选入口与初始空状态。</w:t>
+      </w:r>
+    </w:p>
+    <w:p>
+      <w:pPr>
+        <w:keepNext/>
+        <w:spacing w:before="120" w:after="60"/>
+        <w:jc w:val="center"/>
+      </w:pPr>
+      <w:r>
+        <w:drawing>
+          <wp:inline xmlns:a="http://schemas.openxmlformats.org/drawingml/2006/main" xmlns:pic="http://schemas.openxmlformats.org/drawingml/2006/picture">
+            <wp:extent cx="5715000" cy="3571875"/>
+            <wp:docPr id="2" name="Picture 2" descr="Windows 桌面端搜索筛选面板。显示精确、混合和语义检索模式，以及关键词、文本语义、图像语义和内容类型选项。" title="图 2  筛选面板"/>
+            <wp:cNvGraphicFramePr>
+              <a:graphicFrameLocks noChangeAspect="1"/>
+            </wp:cNvGraphicFramePr>
+            <a:graphic>
+              <a:graphicData uri="http://schemas.openxmlformats.org/drawingml/2006/picture">
+                <pic:pic>
+                  <pic:nvPicPr>
+                    <pic:cNvPr id="0" name="windows-filter-dialog-hc-200.png"/>
+                    <pic:cNvPicPr/>
+                  </pic:nvPicPr>
+                  <pic:blipFill>
+                    <a:blip r:embed="rId14"/>
+                    <a:stretch>
+                      <a:fillRect/>
+                    </a:stretch>
+                  </pic:blipFill>
+                  <pic:spPr>
+                    <a:xfrm>
+                      <a:off x="0" y="0"/>
+                      <a:ext cx="5715000" cy="3571875"/>
+                    </a:xfrm>
+                    <a:prstGeom prst="rect"/>
+                  </pic:spPr>
+                </pic:pic>
+              </a:graphicData>
+            </a:graphic>
+          </wp:inline>
+        </w:drawing>
+      </w:r>
+    </w:p>
+    <w:p>
+      <w:pPr>
+        <w:keepNext w:val="0"/>
+        <w:spacing w:before="0" w:after="160"/>
+        <w:jc w:val="center"/>
+      </w:pPr>
+      <w:r>
+        <w:rPr>
+          <w:rFonts w:ascii="Times New Roman" w:hAnsi="Times New Roman" w:eastAsia="Times New Roman" w:cs="Times New Roman"/>
+          <w:b w:val="0"/>
+          <w:i w:val="0"/>
+          <w:color w:val="000000"/>
+          <w:sz w:val="18"/>
+        </w:rPr>
+        <w:t>图 2  筛选面板：检索模式、检索通道与内容类型选择。</w:t>
       </w:r>
     </w:p>
     <w:p>
@@ -647,7 +774,140 @@
     </w:p>
     <w:p>
       <w:pPr>
+        <w:pStyle w:val="Heading2"/>
+        <w:keepNext/>
+      </w:pPr>
+      <w:r>
+        <w:rPr>
+          <w:rFonts w:ascii="Times New Roman" w:hAnsi="Times New Roman" w:eastAsia="Times New Roman" w:cs="Times New Roman"/>
+          <w:b/>
+          <w:i w:val="0"/>
+          <w:color w:val="000000"/>
+          <w:sz w:val="26"/>
+        </w:rPr>
+        <w:t>3.1 索引库与无障碍设置界面</w:t>
+      </w:r>
+    </w:p>
+    <w:p>
+      <w:pPr>
+        <w:keepNext/>
+        <w:spacing w:before="120" w:after="60"/>
+        <w:jc w:val="center"/>
+      </w:pPr>
+      <w:r>
+        <w:drawing>
+          <wp:inline xmlns:a="http://schemas.openxmlformats.org/drawingml/2006/main" xmlns:pic="http://schemas.openxmlformats.org/drawingml/2006/picture">
+            <wp:extent cx="5715000" cy="3571875"/>
+            <wp:docPr id="3" name="Picture 3" descr="Windows 桌面端索引库页面。页面显示添加文件夹按钮、刷新按钮、文件计数和索引库为空提示。" title="图 3  索引库"/>
+            <wp:cNvGraphicFramePr>
+              <a:graphicFrameLocks noChangeAspect="1"/>
+            </wp:cNvGraphicFramePr>
+            <a:graphic>
+              <a:graphicData uri="http://schemas.openxmlformats.org/drawingml/2006/picture">
+                <pic:pic>
+                  <pic:nvPicPr>
+                    <pic:cNvPr id="0" name="windows-library-empty-hc-200.png"/>
+                    <pic:cNvPicPr/>
+                  </pic:nvPicPr>
+                  <pic:blipFill>
+                    <a:blip r:embed="rId15"/>
+                    <a:stretch>
+                      <a:fillRect/>
+                    </a:stretch>
+                  </pic:blipFill>
+                  <pic:spPr>
+                    <a:xfrm>
+                      <a:off x="0" y="0"/>
+                      <a:ext cx="5715000" cy="3571875"/>
+                    </a:xfrm>
+                    <a:prstGeom prst="rect"/>
+                  </pic:spPr>
+                </pic:pic>
+              </a:graphicData>
+            </a:graphic>
+          </wp:inline>
+        </w:drawing>
+      </w:r>
+    </w:p>
+    <w:p>
+      <w:pPr>
+        <w:keepNext w:val="0"/>
+        <w:spacing w:before="0" w:after="160"/>
+        <w:jc w:val="center"/>
+      </w:pPr>
+      <w:r>
+        <w:rPr>
+          <w:rFonts w:ascii="Times New Roman" w:hAnsi="Times New Roman" w:eastAsia="Times New Roman" w:cs="Times New Roman"/>
+          <w:b w:val="0"/>
+          <w:i w:val="0"/>
+          <w:color w:val="000000"/>
+          <w:sz w:val="18"/>
+        </w:rPr>
+        <w:t>图 3  索引库：文件夹添加入口、刷新操作与空库状态。</w:t>
+      </w:r>
+    </w:p>
+    <w:p>
+      <w:pPr>
+        <w:keepNext/>
+        <w:spacing w:before="120" w:after="60"/>
+        <w:jc w:val="center"/>
+      </w:pPr>
+      <w:r>
+        <w:drawing>
+          <wp:inline xmlns:a="http://schemas.openxmlformats.org/drawingml/2006/main" xmlns:pic="http://schemas.openxmlformats.org/drawingml/2006/picture">
+            <wp:extent cx="5715000" cy="3571875"/>
+            <wp:docPr id="4" name="Picture 4" descr="Windows 桌面端设置页面。深色主题、高对比度、200% 文字大小和减少动态效果均处于启用状态，并提供恢复默认设置与保存设置按钮。" title="图 4  无障碍设置"/>
+            <wp:cNvGraphicFramePr>
+              <a:graphicFrameLocks noChangeAspect="1"/>
+            </wp:cNvGraphicFramePr>
+            <a:graphic>
+              <a:graphicData uri="http://schemas.openxmlformats.org/drawingml/2006/picture">
+                <pic:pic>
+                  <pic:nvPicPr>
+                    <pic:cNvPr id="0" name="windows-settings-hc-200-bottom.png"/>
+                    <pic:cNvPicPr/>
+                  </pic:nvPicPr>
+                  <pic:blipFill>
+                    <a:blip r:embed="rId16"/>
+                    <a:stretch>
+                      <a:fillRect/>
+                    </a:stretch>
+                  </pic:blipFill>
+                  <pic:spPr>
+                    <a:xfrm>
+                      <a:off x="0" y="0"/>
+                      <a:ext cx="5715000" cy="3571875"/>
+                    </a:xfrm>
+                    <a:prstGeom prst="rect"/>
+                  </pic:spPr>
+                </pic:pic>
+              </a:graphicData>
+            </a:graphic>
+          </wp:inline>
+        </w:drawing>
+      </w:r>
+    </w:p>
+    <w:p>
+      <w:pPr>
+        <w:keepNext w:val="0"/>
+        <w:spacing w:before="0" w:after="160"/>
+        <w:jc w:val="center"/>
+      </w:pPr>
+      <w:r>
+        <w:rPr>
+          <w:rFonts w:ascii="Times New Roman" w:hAnsi="Times New Roman" w:eastAsia="Times New Roman" w:cs="Times New Roman"/>
+          <w:b w:val="0"/>
+          <w:i w:val="0"/>
+          <w:color w:val="000000"/>
+          <w:sz w:val="18"/>
+        </w:rPr>
+        <w:t>图 4  无障碍设置：深色主题、高对比度、200% 字号与减少动态效果。</w:t>
+      </w:r>
+    </w:p>
+    <w:p>
+      <w:pPr>
         <w:pStyle w:val="Heading1"/>
+        <w:pageBreakBefore/>
       </w:pPr>
       <w:r>
         <w:t>4. 成功标准与记录字段</w:t>

</xml_diff>